<commit_message>
Replace Q29 with an orbital-only equilibrium question
The 1,3-dicarbonyl equilibrium is better compared with pKa values, so the
quiz now stays purely ARIO. Q29 compares an sp carbanion with an sp2 one.

Co-Authored-By: Claude Sonnet 5.5 <noreply@anthropic.com>
Claude-Session: https://claude.ai/code/session_01Q567TpajQd7bmbFDieU89t
</commit_message>
<xml_diff>
--- a/acids-bases-quiz/Acids_Bases_Quiz.docx
+++ b/acids-bases-quiz/Acids_Bases_Quiz.docx
@@ -3662,7 +3662,7 @@
             <w:r>
               <w:drawing>
                 <wp:inline xmlns:a="http://schemas.openxmlformats.org/drawingml/2006/main" xmlns:pic="http://schemas.openxmlformats.org/drawingml/2006/picture">
-                  <wp:extent cx="5303520" cy="755230"/>
+                  <wp:extent cx="5303520" cy="592476"/>
                   <wp:docPr id="42" name="Picture 42"/>
                   <wp:cNvGraphicFramePr>
                     <a:graphicFrameLocks noChangeAspect="1"/>
@@ -3683,7 +3683,7 @@
                         <pic:spPr>
                           <a:xfrm>
                             <a:off x="0" y="0"/>
-                            <a:ext cx="5303520" cy="755230"/>
+                            <a:ext cx="5303520" cy="592476"/>
                           </a:xfrm>
                           <a:prstGeom prst="rect"/>
                         </pic:spPr>
@@ -3700,7 +3700,7 @@
               <w:ind w:left="792" w:hanging="432"/>
             </w:pPr>
             <w:r>
-              <w:t>A)  The products, because the anion is delocalized over two carbonyl groups</w:t>
+              <w:t>A)  The reactants, because the alkynide (charge in an sp orbital) is more stable than the vinyl anion (charge in an sp² orbital)</w:t>
             </w:r>
           </w:p>
           <w:p>
@@ -3709,7 +3709,7 @@
               <w:ind w:left="792" w:hanging="432"/>
             </w:pPr>
             <w:r>
-              <w:t>B)  The reactants, because hydroxide has the charge on O and the product has the charge on C</w:t>
+              <w:t>B)  The products, because the vinyl anion is resonance stabilized</w:t>
             </w:r>
           </w:p>
           <w:p>
@@ -3718,7 +3718,7 @@
               <w:ind w:left="792" w:hanging="432"/>
             </w:pPr>
             <w:r>
-              <w:t>C)  The reactants, because the product anion is carbon-based</w:t>
+              <w:t>C)  The products, because an sp² orbital is closer to the nucleus than an sp orbital</w:t>
             </w:r>
           </w:p>
           <w:p>
@@ -3727,7 +3727,7 @@
               <w:ind w:left="792" w:hanging="432"/>
             </w:pPr>
             <w:r>
-              <w:t>D)  Neither side, because the product has a charge on only one atom</w:t>
+              <w:t>D)  Neither side, because both anions have the charge on carbon</w:t>
             </w:r>
           </w:p>
         </w:tc>

</xml_diff>